<commit_message>
Anexo A/B/C (estados, codigo, respuestas JSON) + enlace real al repo
Agrega el anexo con los estados verbatim, el codigo de cada experimento
y las respuestas JSON completas al formato Word; actualiza la seccion
de disponibilidad de datos con la URL real del repositorio en vez de
"a solicitud del autor".

Co-Authored-By: Claude Sonnet 5 <noreply@anthropic.com>
</commit_message>
<xml_diff>
--- a/paper/manuscript_v0.3_NCML.docx
+++ b/paper/manuscript_v0.3_NCML.docx
@@ -257,19 +257,19 @@
           <w:b w:val="0"/>
           <w:i w:val="0"/>
         </w:rPr>
-        <w:t>La oposición binaria "chat libre vs. tipado" simplifica demasiado el panorama real. La Figura 1 posiciona cinco categorías en dos ejes: flexibilidad del esquema de entrada y costo computacional.</w:t>
-      </w:r>
-    </w:p>
-    <w:p>
-      <w:pPr>
-        <w:pStyle w:val="Papertext"/>
-      </w:pPr>
-      <w:r>
-        <w:rPr>
-          <w:b w:val="0"/>
-          <w:i w:val="0"/>
-        </w:rPr>
-        <w:t>1. Modelos de chat generativos — texto libre, sin garantía de formato ni de tipo.</w:t>
+        <w:t>La oposición binaria "chat libre vs. tipado" simplifica demasiado el panorama real. La Figura 1 posiciona cinco categorías en dos ejes: costo computacional y rigidez/momento de fijación del esquema de decisión — no "flexibilidad de entrada", una formulación de una versión anterior de esta figura que inducía a una lectura errónea (sugería que el chat generativo era menos flexible que un modelo tipado, cuando es exactamente lo contrario en términos de qué se le puede preguntar). El eje correcto va de un esquema fijado en el entrenamiento (categoría 4, la más rígida) a un esquema declarado en cada llamada (categorías 2, 3 y 5) hasta la ausencia total de esquema (categoría 1, texto libre — la máxima libertad expresiva posible, pero con cero garantía estructural sobre la respuesta).</w:t>
+      </w:r>
+    </w:p>
+    <w:p>
+      <w:pPr>
+        <w:pStyle w:val="Papertext"/>
+      </w:pPr>
+      <w:r>
+        <w:rPr>
+          <w:b w:val="0"/>
+          <w:i w:val="0"/>
+        </w:rPr>
+        <w:t>1. Modelos de chat generativos — texto libre, sin garantía de formato ni de tipo. Es el extremo sin esquema del eje: acepta cualquier pregunta, pero no ofrece ninguna garantía sobre la forma de la respuesta.</w:t>
       </w:r>
     </w:p>
     <w:p>
@@ -352,7 +352,7 @@
       <w:r>
         <w:drawing>
           <wp:inline xmlns:a="http://schemas.openxmlformats.org/drawingml/2006/main" xmlns:pic="http://schemas.openxmlformats.org/drawingml/2006/picture">
-            <wp:extent cx="4860000" cy="3735529"/>
+            <wp:extent cx="4860000" cy="3757656"/>
             <wp:docPr id="1" name="Picture 1"/>
             <wp:cNvGraphicFramePr>
               <a:graphicFrameLocks noChangeAspect="1"/>
@@ -373,7 +373,7 @@
                   <pic:spPr>
                     <a:xfrm>
                       <a:off x="0" y="0"/>
-                      <a:ext cx="4860000" cy="3735529"/>
+                      <a:ext cx="4860000" cy="3757656"/>
                     </a:xfrm>
                     <a:prstGeom prst="rect"/>
                   </pic:spPr>
@@ -394,7 +394,7 @@
           <w:b w:val="0"/>
           <w:i w:val="0"/>
         </w:rPr>
-        <w:t>Figura 1: Posicionamiento de las cinco categorías de interacción con modelos de IA. Jev se ubica en la convergencia entre el juez basado en LLM (categoría 3) y el clasificador discriminativo clásico (categoría 4). Fuente: elaboración propia.</w:t>
+        <w:t>Figura 1: Posicionamiento de las cinco categorías de interacción con modelos de IA según rigidez/momento de fijación del esquema (eje x: fijo en entrenamiento → declarado en cada llamada → sin esquema) y costo computacional (eje y). Jev se ubica en la convergencia entre el juez basado en LLM (categoría 3) y el clasificador discriminativo clásico (categoría 4); el chat generativo (categoría 1) ocupa el extremo sin esquema — máxima libertad expresiva, cero garantía estructural. Fuente: elaboración propia.</w:t>
       </w:r>
     </w:p>
     <w:p>
@@ -2493,7 +2493,7 @@
           <w:b w:val="0"/>
           <w:i w:val="0"/>
         </w:rPr>
-        <w:t>El script y resultados del Experimento 1 (run_experiment.mjs, results.json), del Experimento 2 (run_experiment_choice.mjs, results_choice.json) y del Experimento 3 (run_experiment_choice_binary.mjs, results_choice_binary.json), y el script de la Figura 1 (make_fig1_taxonomy.py), están disponibles a solicitud del autor de correspondencia.</w:t>
+        <w:t>Repositorio público: https://github.com/mleyvaz/jev-typed-evaluation-collapse — incluye el script y resultados del Experimento 1 (run_experiment.mjs, results.json), del Experimento 2 (run_experiment_choice.mjs, results_choice.json), del Experimento 3 (run_experiment_choice_binary.mjs, results_choice_binary.json), el script de la Figura 1 (make_fig1_taxonomy.py), y la ronda de revisión adversarial que motivó las revisiones v0.1 → v0.2 → v0.3.</w:t>
       </w:r>
     </w:p>
     <w:p>
@@ -2673,7 +2673,7 @@
         </w:rPr>
         <w:t>[12]</w:t>
         <w:tab/>
-        <w:t>Flexible and Efficient Grammar-Constrained Decoding. arXiv:2502.05111, 2026.</w:t>
+        <w:t>Park, K., Zhou, T., D'Antoni, L. (2025). Flexible and Efficient Grammar-Constrained Decoding. arXiv:2502.05111. Tambien en ICML 2025.</w:t>
       </w:r>
     </w:p>
     <w:p>
@@ -2687,7 +2687,7 @@
         </w:rPr>
         <w:t>[13]</w:t>
         <w:tab/>
-        <w:t>An Empirical Study of LLM-as-a-Judge for LLM Evaluation: Fine-tuned Judge Model is not a General Substitute for GPT-4. arXiv:2403.02839.</w:t>
+        <w:t>Huang, H., Bu, X., Zhou, H., Qu, Y., Liu, J., Yang, M., Xu, B., Zhao, T. (2024). An Empirical Study of LLM-as-a-Judge for LLM Evaluation: Fine-tuned Judge Model is not a General Substitute for GPT-4. arXiv:2403.02839. Findings of ACL 2025.</w:t>
       </w:r>
     </w:p>
     <w:p>
@@ -2701,7 +2701,7 @@
         </w:rPr>
         <w:t>[14]</w:t>
         <w:tab/>
-        <w:t>A survey on LLM-as-a-judge. ScienceDirect, 2026.</w:t>
+        <w:t>Gu, J., Jiang, X., Shi, Z., Tian, H., Zhai, X., Xu, C., et al. (2026). A survey on LLM-as-a-judge. The Innovation, 7(6), 101253.</w:t>
       </w:r>
     </w:p>
     <w:p>
@@ -2721,6 +2721,1163 @@
         </w:rPr>
         <w:t>Received: September 19, 2026.   Accepted: —</w:t>
       </w:r>
+    </w:p>
+    <w:p>
+      <w:pPr>
+        <w:pStyle w:val="Sectiontitle"/>
+      </w:pPr>
+      <w:r>
+        <w:rPr>
+          <w:b w:val="0"/>
+          <w:i w:val="0"/>
+        </w:rPr>
+        <w:t>Anexo A. Estados de entrada (verbatim)</w:t>
+      </w:r>
+    </w:p>
+    <w:p>
+      <w:pPr>
+        <w:pStyle w:val="Papertext"/>
+      </w:pPr>
+      <w:r>
+        <w:rPr>
+          <w:b w:val="0"/>
+          <w:i w:val="0"/>
+        </w:rPr>
+        <w:t>Los seis estados (state) usados en los tres experimentos, idénticos en cada uno — solo cambia la pregunta (questions) que se declara sobre ellos.</w:t>
+      </w:r>
+    </w:p>
+    <w:p>
+      <w:pPr>
+        <w:pStyle w:val="Papertext"/>
+      </w:pPr>
+      <w:r>
+        <w:rPr>
+          <w:b/>
+          <w:i w:val="0"/>
+        </w:rPr>
+        <w:t>TORN-1 (conflicto genuino)</w:t>
+      </w:r>
+    </w:p>
+    <w:p>
+      <w:pPr>
+        <w:pStyle w:val="Papertext"/>
+      </w:pPr>
+      <w:r>
+        <w:rPr>
+          <w:b w:val="0"/>
+          <w:i/>
+        </w:rPr>
+        <w:t>Witness A, a police officer with a clear view of the intersection, testified under oath that the traffic light was red at the moment of the collision. Witness B, a bystander standing next to Witness A with an equally clear view, testified under oath that the same traffic light was green at that exact moment. Both witnesses are considered reliable by the investigating officer; there is no indication either one is lying.</w:t>
+      </w:r>
+    </w:p>
+    <w:p>
+      <w:pPr>
+        <w:pStyle w:val="Papertext"/>
+      </w:pPr>
+      <w:r>
+        <w:rPr>
+          <w:b/>
+          <w:i w:val="0"/>
+        </w:rPr>
+        <w:t>TORN-2 (conflicto genuino)</w:t>
+      </w:r>
+    </w:p>
+    <w:p>
+      <w:pPr>
+        <w:pStyle w:val="Papertext"/>
+      </w:pPr>
+      <w:r>
+        <w:rPr>
+          <w:b w:val="0"/>
+          <w:i/>
+        </w:rPr>
+        <w:t>Sensor 1, a calibrated high-precision traffic sensor, recorded the light as RED at 14:03:02. Sensor 2, an equally calibrated high-precision sensor mounted on the same pole, recorded the light as GREEN at the same timestamp, 14:03:02. Both sensors passed their most recent calibration check with no faults reported.</w:t>
+      </w:r>
+    </w:p>
+    <w:p>
+      <w:pPr>
+        <w:pStyle w:val="Papertext"/>
+      </w:pPr>
+      <w:r>
+        <w:rPr>
+          <w:b/>
+          <w:i w:val="0"/>
+        </w:rPr>
+        <w:t>SILENT-1 (ignorancia genuina)</w:t>
+      </w:r>
+    </w:p>
+    <w:p>
+      <w:pPr>
+        <w:pStyle w:val="Papertext"/>
+      </w:pPr>
+      <w:r>
+        <w:rPr>
+          <w:b w:val="0"/>
+          <w:i/>
+        </w:rPr>
+        <w:t>No witnesses were present at the intersection at the time in question. No traffic cameras were operating in that area that day. There is no record, sensor log, or testimony of any kind describing the state of the traffic light at that moment.</w:t>
+      </w:r>
+    </w:p>
+    <w:p>
+      <w:pPr>
+        <w:pStyle w:val="Papertext"/>
+      </w:pPr>
+      <w:r>
+        <w:rPr>
+          <w:b/>
+          <w:i w:val="0"/>
+        </w:rPr>
+        <w:t>SILENT-2 (ignorancia genuina)</w:t>
+      </w:r>
+    </w:p>
+    <w:p>
+      <w:pPr>
+        <w:pStyle w:val="Papertext"/>
+      </w:pPr>
+      <w:r>
+        <w:rPr>
+          <w:b w:val="0"/>
+          <w:i/>
+        </w:rPr>
+        <w:t>The traffic light's camera log for that day was permanently lost in a server failure before any backup was made. No witnesses have come forward. No other observation of the light exists in any form.</w:t>
+      </w:r>
+    </w:p>
+    <w:p>
+      <w:pPr>
+        <w:pStyle w:val="Papertext"/>
+      </w:pPr>
+      <w:r>
+        <w:rPr>
+          <w:b/>
+          <w:i w:val="0"/>
+        </w:rPr>
+        <w:t>AGREE-SUPPORT (control, apoyo)</w:t>
+      </w:r>
+    </w:p>
+    <w:p>
+      <w:pPr>
+        <w:pStyle w:val="Papertext"/>
+      </w:pPr>
+      <w:r>
+        <w:rPr>
+          <w:b w:val="0"/>
+          <w:i/>
+        </w:rPr>
+        <w:t>Witness A testified that the traffic light was red at the time of the collision. Witness B, standing nearby with an independent line of sight, separately and independently confirmed that the light was red at that same moment.</w:t>
+      </w:r>
+    </w:p>
+    <w:p>
+      <w:pPr>
+        <w:pStyle w:val="Papertext"/>
+      </w:pPr>
+      <w:r>
+        <w:rPr>
+          <w:b/>
+          <w:i w:val="0"/>
+        </w:rPr>
+        <w:t>AGREE-REFUTE (control, refutación)</w:t>
+      </w:r>
+    </w:p>
+    <w:p>
+      <w:pPr>
+        <w:pStyle w:val="Papertext"/>
+      </w:pPr>
+      <w:r>
+        <w:rPr>
+          <w:b w:val="0"/>
+          <w:i/>
+        </w:rPr>
+        <w:t>Witness A testified that the traffic light was green, not red, at the time of the collision. Witness B, standing nearby with an independent line of sight, separately and independently confirmed that the light was green at that same moment.</w:t>
+      </w:r>
+    </w:p>
+    <w:p>
+      <w:pPr>
+        <w:pStyle w:val="Sectiontitle"/>
+      </w:pPr>
+      <w:r>
+        <w:rPr>
+          <w:b w:val="0"/>
+          <w:i w:val="0"/>
+        </w:rPr>
+        <w:t>Anexo B. Código de la llamada, por experimento</w:t>
+      </w:r>
+    </w:p>
+    <w:p>
+      <w:pPr>
+        <w:pStyle w:val="Papertext"/>
+      </w:pPr>
+      <w:r>
+        <w:rPr>
+          <w:b/>
+          <w:i w:val="0"/>
+        </w:rPr>
+        <w:t>Experimento 1 (boolean/Noul):</w:t>
+      </w:r>
+    </w:p>
+    <w:p>
+      <w:pPr>
+        <w:pStyle w:val="Papertext"/>
+        <w:spacing w:line="240" w:lineRule="auto" w:before="0" w:after="0"/>
+      </w:pPr>
+      <w:r>
+        <w:rPr>
+          <w:rFonts w:ascii="Courier New" w:hAnsi="Courier New"/>
+          <w:sz w:val="16"/>
+        </w:rPr>
+        <w:t>import { experimental_evaluate as evaluate } from 'ai';</w:t>
+      </w:r>
+    </w:p>
+    <w:p>
+      <w:pPr>
+        <w:pStyle w:val="Papertext"/>
+        <w:spacing w:line="240" w:lineRule="auto" w:before="0" w:after="0"/>
+      </w:pPr>
+      <w:r>
+        <w:rPr>
+          <w:rFonts w:ascii="Courier New" w:hAnsi="Courier New"/>
+          <w:sz w:val="16"/>
+        </w:rPr>
+        <w:t xml:space="preserve"> </w:t>
+      </w:r>
+    </w:p>
+    <w:p>
+      <w:pPr>
+        <w:pStyle w:val="Papertext"/>
+        <w:spacing w:line="240" w:lineRule="auto" w:before="0" w:after="0"/>
+      </w:pPr>
+      <w:r>
+        <w:rPr>
+          <w:rFonts w:ascii="Courier New" w:hAnsi="Courier New"/>
+          <w:sz w:val="16"/>
+        </w:rPr>
+        <w:t>const result = await evaluate({</w:t>
+      </w:r>
+    </w:p>
+    <w:p>
+      <w:pPr>
+        <w:pStyle w:val="Papertext"/>
+        <w:spacing w:line="240" w:lineRule="auto" w:before="0" w:after="0"/>
+      </w:pPr>
+      <w:r>
+        <w:rPr>
+          <w:rFonts w:ascii="Courier New" w:hAnsi="Courier New"/>
+          <w:sz w:val="16"/>
+        </w:rPr>
+        <w:t xml:space="preserve">  model: 'typesafe-ai/jev',</w:t>
+      </w:r>
+    </w:p>
+    <w:p>
+      <w:pPr>
+        <w:pStyle w:val="Papertext"/>
+        <w:spacing w:line="240" w:lineRule="auto" w:before="0" w:after="0"/>
+      </w:pPr>
+      <w:r>
+        <w:rPr>
+          <w:rFonts w:ascii="Courier New" w:hAnsi="Courier New"/>
+          <w:sz w:val="16"/>
+        </w:rPr>
+        <w:t xml:space="preserve">  state: STATE_TEXT, // uno de los seis estados del Anexo A</w:t>
+      </w:r>
+    </w:p>
+    <w:p>
+      <w:pPr>
+        <w:pStyle w:val="Papertext"/>
+        <w:spacing w:line="240" w:lineRule="auto" w:before="0" w:after="0"/>
+      </w:pPr>
+      <w:r>
+        <w:rPr>
+          <w:rFonts w:ascii="Courier New" w:hAnsi="Courier New"/>
+          <w:sz w:val="16"/>
+        </w:rPr>
+        <w:t xml:space="preserve">  questions: {</w:t>
+      </w:r>
+    </w:p>
+    <w:p>
+      <w:pPr>
+        <w:pStyle w:val="Papertext"/>
+        <w:spacing w:line="240" w:lineRule="auto" w:before="0" w:after="0"/>
+      </w:pPr>
+      <w:r>
+        <w:rPr>
+          <w:rFonts w:ascii="Courier New" w:hAnsi="Courier New"/>
+          <w:sz w:val="16"/>
+        </w:rPr>
+        <w:t xml:space="preserve">    wasRed: {</w:t>
+      </w:r>
+    </w:p>
+    <w:p>
+      <w:pPr>
+        <w:pStyle w:val="Papertext"/>
+        <w:spacing w:line="240" w:lineRule="auto" w:before="0" w:after="0"/>
+      </w:pPr>
+      <w:r>
+        <w:rPr>
+          <w:rFonts w:ascii="Courier New" w:hAnsi="Courier New"/>
+          <w:sz w:val="16"/>
+        </w:rPr>
+        <w:t xml:space="preserve">      type: 'boolean',</w:t>
+      </w:r>
+    </w:p>
+    <w:p>
+      <w:pPr>
+        <w:pStyle w:val="Papertext"/>
+        <w:spacing w:line="240" w:lineRule="auto" w:before="0" w:after="0"/>
+      </w:pPr>
+      <w:r>
+        <w:rPr>
+          <w:rFonts w:ascii="Courier New" w:hAnsi="Courier New"/>
+          <w:sz w:val="16"/>
+        </w:rPr>
+        <w:t xml:space="preserve">      instructions: 'Was the traffic light red at the time in question?',</w:t>
+      </w:r>
+    </w:p>
+    <w:p>
+      <w:pPr>
+        <w:pStyle w:val="Papertext"/>
+        <w:spacing w:line="240" w:lineRule="auto" w:before="0" w:after="0"/>
+      </w:pPr>
+      <w:r>
+        <w:rPr>
+          <w:rFonts w:ascii="Courier New" w:hAnsi="Courier New"/>
+          <w:sz w:val="16"/>
+        </w:rPr>
+        <w:t xml:space="preserve">    },</w:t>
+      </w:r>
+    </w:p>
+    <w:p>
+      <w:pPr>
+        <w:pStyle w:val="Papertext"/>
+        <w:spacing w:line="240" w:lineRule="auto" w:before="0" w:after="0"/>
+      </w:pPr>
+      <w:r>
+        <w:rPr>
+          <w:rFonts w:ascii="Courier New" w:hAnsi="Courier New"/>
+          <w:sz w:val="16"/>
+        </w:rPr>
+        <w:t xml:space="preserve">  },</w:t>
+      </w:r>
+    </w:p>
+    <w:p>
+      <w:pPr>
+        <w:pStyle w:val="Papertext"/>
+        <w:spacing w:line="240" w:lineRule="auto" w:before="0" w:after="0"/>
+      </w:pPr>
+      <w:r>
+        <w:rPr>
+          <w:rFonts w:ascii="Courier New" w:hAnsi="Courier New"/>
+          <w:sz w:val="16"/>
+        </w:rPr>
+        <w:t>});</w:t>
+      </w:r>
+    </w:p>
+    <w:p>
+      <w:pPr>
+        <w:pStyle w:val="Papertext"/>
+        <w:spacing w:after="120"/>
+      </w:pPr>
+    </w:p>
+    <w:p>
+      <w:pPr>
+        <w:pStyle w:val="Papertext"/>
+      </w:pPr>
+      <w:r>
+        <w:rPr>
+          <w:b/>
+          <w:i w:val="0"/>
+        </w:rPr>
+        <w:t>Experimento 2 (Choice, esquema enriquecido):</w:t>
+      </w:r>
+    </w:p>
+    <w:p>
+      <w:pPr>
+        <w:pStyle w:val="Papertext"/>
+        <w:spacing w:line="240" w:lineRule="auto" w:before="0" w:after="0"/>
+      </w:pPr>
+      <w:r>
+        <w:rPr>
+          <w:rFonts w:ascii="Courier New" w:hAnsi="Courier New"/>
+          <w:sz w:val="16"/>
+        </w:rPr>
+        <w:t>const result = await evaluate({</w:t>
+      </w:r>
+    </w:p>
+    <w:p>
+      <w:pPr>
+        <w:pStyle w:val="Papertext"/>
+        <w:spacing w:line="240" w:lineRule="auto" w:before="0" w:after="0"/>
+      </w:pPr>
+      <w:r>
+        <w:rPr>
+          <w:rFonts w:ascii="Courier New" w:hAnsi="Courier New"/>
+          <w:sz w:val="16"/>
+        </w:rPr>
+        <w:t xml:space="preserve">  model: 'typesafe-ai/jev',</w:t>
+      </w:r>
+    </w:p>
+    <w:p>
+      <w:pPr>
+        <w:pStyle w:val="Papertext"/>
+        <w:spacing w:line="240" w:lineRule="auto" w:before="0" w:after="0"/>
+      </w:pPr>
+      <w:r>
+        <w:rPr>
+          <w:rFonts w:ascii="Courier New" w:hAnsi="Courier New"/>
+          <w:sz w:val="16"/>
+        </w:rPr>
+        <w:t xml:space="preserve">  state: STATE_TEXT,</w:t>
+      </w:r>
+    </w:p>
+    <w:p>
+      <w:pPr>
+        <w:pStyle w:val="Papertext"/>
+        <w:spacing w:line="240" w:lineRule="auto" w:before="0" w:after="0"/>
+      </w:pPr>
+      <w:r>
+        <w:rPr>
+          <w:rFonts w:ascii="Courier New" w:hAnsi="Courier New"/>
+          <w:sz w:val="16"/>
+        </w:rPr>
+        <w:t xml:space="preserve">  questions: {</w:t>
+      </w:r>
+    </w:p>
+    <w:p>
+      <w:pPr>
+        <w:pStyle w:val="Papertext"/>
+        <w:spacing w:line="240" w:lineRule="auto" w:before="0" w:after="0"/>
+      </w:pPr>
+      <w:r>
+        <w:rPr>
+          <w:rFonts w:ascii="Courier New" w:hAnsi="Courier New"/>
+          <w:sz w:val="16"/>
+        </w:rPr>
+        <w:t xml:space="preserve">    lightState: {</w:t>
+      </w:r>
+    </w:p>
+    <w:p>
+      <w:pPr>
+        <w:pStyle w:val="Papertext"/>
+        <w:spacing w:line="240" w:lineRule="auto" w:before="0" w:after="0"/>
+      </w:pPr>
+      <w:r>
+        <w:rPr>
+          <w:rFonts w:ascii="Courier New" w:hAnsi="Courier New"/>
+          <w:sz w:val="16"/>
+        </w:rPr>
+        <w:t xml:space="preserve">      type: 'choice',</w:t>
+      </w:r>
+    </w:p>
+    <w:p>
+      <w:pPr>
+        <w:pStyle w:val="Papertext"/>
+        <w:spacing w:line="240" w:lineRule="auto" w:before="0" w:after="0"/>
+      </w:pPr>
+      <w:r>
+        <w:rPr>
+          <w:rFonts w:ascii="Courier New" w:hAnsi="Courier New"/>
+          <w:sz w:val="16"/>
+        </w:rPr>
+        <w:t xml:space="preserve">      instructions: 'What was the state of the traffic light at the time in question?',</w:t>
+      </w:r>
+    </w:p>
+    <w:p>
+      <w:pPr>
+        <w:pStyle w:val="Papertext"/>
+        <w:spacing w:line="240" w:lineRule="auto" w:before="0" w:after="0"/>
+      </w:pPr>
+      <w:r>
+        <w:rPr>
+          <w:rFonts w:ascii="Courier New" w:hAnsi="Courier New"/>
+          <w:sz w:val="16"/>
+        </w:rPr>
+        <w:t xml:space="preserve">      criteria: {</w:t>
+      </w:r>
+    </w:p>
+    <w:p>
+      <w:pPr>
+        <w:pStyle w:val="Papertext"/>
+        <w:spacing w:line="240" w:lineRule="auto" w:before="0" w:after="0"/>
+      </w:pPr>
+      <w:r>
+        <w:rPr>
+          <w:rFonts w:ascii="Courier New" w:hAnsi="Courier New"/>
+          <w:sz w:val="16"/>
+        </w:rPr>
+        <w:t xml:space="preserve">        red: 'The evidence indicates the light was red.',</w:t>
+      </w:r>
+    </w:p>
+    <w:p>
+      <w:pPr>
+        <w:pStyle w:val="Papertext"/>
+        <w:spacing w:line="240" w:lineRule="auto" w:before="0" w:after="0"/>
+      </w:pPr>
+      <w:r>
+        <w:rPr>
+          <w:rFonts w:ascii="Courier New" w:hAnsi="Courier New"/>
+          <w:sz w:val="16"/>
+        </w:rPr>
+        <w:t xml:space="preserve">        green: 'The evidence indicates the light was green (not red).',</w:t>
+      </w:r>
+    </w:p>
+    <w:p>
+      <w:pPr>
+        <w:pStyle w:val="Papertext"/>
+        <w:spacing w:line="240" w:lineRule="auto" w:before="0" w:after="0"/>
+      </w:pPr>
+      <w:r>
+        <w:rPr>
+          <w:rFonts w:ascii="Courier New" w:hAnsi="Courier New"/>
+          <w:sz w:val="16"/>
+        </w:rPr>
+        <w:t xml:space="preserve">        conflicting_evidence: 'Reliable sources disagree with each other about the color.',</w:t>
+      </w:r>
+    </w:p>
+    <w:p>
+      <w:pPr>
+        <w:pStyle w:val="Papertext"/>
+        <w:spacing w:line="240" w:lineRule="auto" w:before="0" w:after="0"/>
+      </w:pPr>
+      <w:r>
+        <w:rPr>
+          <w:rFonts w:ascii="Courier New" w:hAnsi="Courier New"/>
+          <w:sz w:val="16"/>
+        </w:rPr>
+        <w:t xml:space="preserve">        insufficient_evidence: 'There is no evidence available to determine the color.',</w:t>
+      </w:r>
+    </w:p>
+    <w:p>
+      <w:pPr>
+        <w:pStyle w:val="Papertext"/>
+        <w:spacing w:line="240" w:lineRule="auto" w:before="0" w:after="0"/>
+      </w:pPr>
+      <w:r>
+        <w:rPr>
+          <w:rFonts w:ascii="Courier New" w:hAnsi="Courier New"/>
+          <w:sz w:val="16"/>
+        </w:rPr>
+        <w:t xml:space="preserve">      },</w:t>
+      </w:r>
+    </w:p>
+    <w:p>
+      <w:pPr>
+        <w:pStyle w:val="Papertext"/>
+        <w:spacing w:line="240" w:lineRule="auto" w:before="0" w:after="0"/>
+      </w:pPr>
+      <w:r>
+        <w:rPr>
+          <w:rFonts w:ascii="Courier New" w:hAnsi="Courier New"/>
+          <w:sz w:val="16"/>
+        </w:rPr>
+        <w:t xml:space="preserve">    },</w:t>
+      </w:r>
+    </w:p>
+    <w:p>
+      <w:pPr>
+        <w:pStyle w:val="Papertext"/>
+        <w:spacing w:line="240" w:lineRule="auto" w:before="0" w:after="0"/>
+      </w:pPr>
+      <w:r>
+        <w:rPr>
+          <w:rFonts w:ascii="Courier New" w:hAnsi="Courier New"/>
+          <w:sz w:val="16"/>
+        </w:rPr>
+        <w:t xml:space="preserve">  },</w:t>
+      </w:r>
+    </w:p>
+    <w:p>
+      <w:pPr>
+        <w:pStyle w:val="Papertext"/>
+        <w:spacing w:line="240" w:lineRule="auto" w:before="0" w:after="0"/>
+      </w:pPr>
+      <w:r>
+        <w:rPr>
+          <w:rFonts w:ascii="Courier New" w:hAnsi="Courier New"/>
+          <w:sz w:val="16"/>
+        </w:rPr>
+        <w:t>});</w:t>
+      </w:r>
+    </w:p>
+    <w:p>
+      <w:pPr>
+        <w:pStyle w:val="Papertext"/>
+        <w:spacing w:after="120"/>
+      </w:pPr>
+    </w:p>
+    <w:p>
+      <w:pPr>
+        <w:pStyle w:val="Papertext"/>
+      </w:pPr>
+      <w:r>
+        <w:rPr>
+          <w:b/>
+          <w:i w:val="0"/>
+        </w:rPr>
+        <w:t>Experimento 3 (Choice binario, sin categorías de escape):</w:t>
+      </w:r>
+    </w:p>
+    <w:p>
+      <w:pPr>
+        <w:pStyle w:val="Papertext"/>
+        <w:spacing w:line="240" w:lineRule="auto" w:before="0" w:after="0"/>
+      </w:pPr>
+      <w:r>
+        <w:rPr>
+          <w:rFonts w:ascii="Courier New" w:hAnsi="Courier New"/>
+          <w:sz w:val="16"/>
+        </w:rPr>
+        <w:t>const result = await evaluate({</w:t>
+      </w:r>
+    </w:p>
+    <w:p>
+      <w:pPr>
+        <w:pStyle w:val="Papertext"/>
+        <w:spacing w:line="240" w:lineRule="auto" w:before="0" w:after="0"/>
+      </w:pPr>
+      <w:r>
+        <w:rPr>
+          <w:rFonts w:ascii="Courier New" w:hAnsi="Courier New"/>
+          <w:sz w:val="16"/>
+        </w:rPr>
+        <w:t xml:space="preserve">  model: 'typesafe-ai/jev',</w:t>
+      </w:r>
+    </w:p>
+    <w:p>
+      <w:pPr>
+        <w:pStyle w:val="Papertext"/>
+        <w:spacing w:line="240" w:lineRule="auto" w:before="0" w:after="0"/>
+      </w:pPr>
+      <w:r>
+        <w:rPr>
+          <w:rFonts w:ascii="Courier New" w:hAnsi="Courier New"/>
+          <w:sz w:val="16"/>
+        </w:rPr>
+        <w:t xml:space="preserve">  state: STATE_TEXT,</w:t>
+      </w:r>
+    </w:p>
+    <w:p>
+      <w:pPr>
+        <w:pStyle w:val="Papertext"/>
+        <w:spacing w:line="240" w:lineRule="auto" w:before="0" w:after="0"/>
+      </w:pPr>
+      <w:r>
+        <w:rPr>
+          <w:rFonts w:ascii="Courier New" w:hAnsi="Courier New"/>
+          <w:sz w:val="16"/>
+        </w:rPr>
+        <w:t xml:space="preserve">  questions: {</w:t>
+      </w:r>
+    </w:p>
+    <w:p>
+      <w:pPr>
+        <w:pStyle w:val="Papertext"/>
+        <w:spacing w:line="240" w:lineRule="auto" w:before="0" w:after="0"/>
+      </w:pPr>
+      <w:r>
+        <w:rPr>
+          <w:rFonts w:ascii="Courier New" w:hAnsi="Courier New"/>
+          <w:sz w:val="16"/>
+        </w:rPr>
+        <w:t xml:space="preserve">    lightState: {</w:t>
+      </w:r>
+    </w:p>
+    <w:p>
+      <w:pPr>
+        <w:pStyle w:val="Papertext"/>
+        <w:spacing w:line="240" w:lineRule="auto" w:before="0" w:after="0"/>
+      </w:pPr>
+      <w:r>
+        <w:rPr>
+          <w:rFonts w:ascii="Courier New" w:hAnsi="Courier New"/>
+          <w:sz w:val="16"/>
+        </w:rPr>
+        <w:t xml:space="preserve">      type: 'choice',</w:t>
+      </w:r>
+    </w:p>
+    <w:p>
+      <w:pPr>
+        <w:pStyle w:val="Papertext"/>
+        <w:spacing w:line="240" w:lineRule="auto" w:before="0" w:after="0"/>
+      </w:pPr>
+      <w:r>
+        <w:rPr>
+          <w:rFonts w:ascii="Courier New" w:hAnsi="Courier New"/>
+          <w:sz w:val="16"/>
+        </w:rPr>
+        <w:t xml:space="preserve">      instructions: 'What was the state of the traffic light at the time in question?',</w:t>
+      </w:r>
+    </w:p>
+    <w:p>
+      <w:pPr>
+        <w:pStyle w:val="Papertext"/>
+        <w:spacing w:line="240" w:lineRule="auto" w:before="0" w:after="0"/>
+      </w:pPr>
+      <w:r>
+        <w:rPr>
+          <w:rFonts w:ascii="Courier New" w:hAnsi="Courier New"/>
+          <w:sz w:val="16"/>
+        </w:rPr>
+        <w:t xml:space="preserve">      criteria: {</w:t>
+      </w:r>
+    </w:p>
+    <w:p>
+      <w:pPr>
+        <w:pStyle w:val="Papertext"/>
+        <w:spacing w:line="240" w:lineRule="auto" w:before="0" w:after="0"/>
+      </w:pPr>
+      <w:r>
+        <w:rPr>
+          <w:rFonts w:ascii="Courier New" w:hAnsi="Courier New"/>
+          <w:sz w:val="16"/>
+        </w:rPr>
+        <w:t xml:space="preserve">        red: 'The evidence indicates the light was red.',</w:t>
+      </w:r>
+    </w:p>
+    <w:p>
+      <w:pPr>
+        <w:pStyle w:val="Papertext"/>
+        <w:spacing w:line="240" w:lineRule="auto" w:before="0" w:after="0"/>
+      </w:pPr>
+      <w:r>
+        <w:rPr>
+          <w:rFonts w:ascii="Courier New" w:hAnsi="Courier New"/>
+          <w:sz w:val="16"/>
+        </w:rPr>
+        <w:t xml:space="preserve">        green: 'The evidence indicates the light was green (not red).',</w:t>
+      </w:r>
+    </w:p>
+    <w:p>
+      <w:pPr>
+        <w:pStyle w:val="Papertext"/>
+        <w:spacing w:line="240" w:lineRule="auto" w:before="0" w:after="0"/>
+      </w:pPr>
+      <w:r>
+        <w:rPr>
+          <w:rFonts w:ascii="Courier New" w:hAnsi="Courier New"/>
+          <w:sz w:val="16"/>
+        </w:rPr>
+        <w:t xml:space="preserve">      },</w:t>
+      </w:r>
+    </w:p>
+    <w:p>
+      <w:pPr>
+        <w:pStyle w:val="Papertext"/>
+        <w:spacing w:line="240" w:lineRule="auto" w:before="0" w:after="0"/>
+      </w:pPr>
+      <w:r>
+        <w:rPr>
+          <w:rFonts w:ascii="Courier New" w:hAnsi="Courier New"/>
+          <w:sz w:val="16"/>
+        </w:rPr>
+        <w:t xml:space="preserve">    },</w:t>
+      </w:r>
+    </w:p>
+    <w:p>
+      <w:pPr>
+        <w:pStyle w:val="Papertext"/>
+        <w:spacing w:line="240" w:lineRule="auto" w:before="0" w:after="0"/>
+      </w:pPr>
+      <w:r>
+        <w:rPr>
+          <w:rFonts w:ascii="Courier New" w:hAnsi="Courier New"/>
+          <w:sz w:val="16"/>
+        </w:rPr>
+        <w:t xml:space="preserve">  },</w:t>
+      </w:r>
+    </w:p>
+    <w:p>
+      <w:pPr>
+        <w:pStyle w:val="Papertext"/>
+        <w:spacing w:line="240" w:lineRule="auto" w:before="0" w:after="0"/>
+      </w:pPr>
+      <w:r>
+        <w:rPr>
+          <w:rFonts w:ascii="Courier New" w:hAnsi="Courier New"/>
+          <w:sz w:val="16"/>
+        </w:rPr>
+        <w:t>});</w:t>
+      </w:r>
+    </w:p>
+    <w:p>
+      <w:pPr>
+        <w:pStyle w:val="Papertext"/>
+        <w:spacing w:after="120"/>
+      </w:pPr>
+    </w:p>
+    <w:p>
+      <w:pPr>
+        <w:pStyle w:val="Sectiontitle"/>
+      </w:pPr>
+      <w:r>
+        <w:rPr>
+          <w:b w:val="0"/>
+          <w:i w:val="0"/>
+        </w:rPr>
+        <w:t>Anexo C. Respuesta completa (answers) por caso</w:t>
+      </w:r>
+    </w:p>
+    <w:p>
+      <w:pPr>
+        <w:pStyle w:val="Papertext"/>
+      </w:pPr>
+      <w:r>
+        <w:rPr>
+          <w:b w:val="0"/>
+          <w:i w:val="0"/>
+        </w:rPr>
+        <w:t>Objeto answers devuelto por Jev para cada caso completado, sin editar (el objeto completo de respuesta incluye además usage, warnings, rounding y providerMetadata, disponibles en los archivos results*.json del repositorio).</w:t>
+      </w:r>
+    </w:p>
+    <w:p>
+      <w:pPr>
+        <w:pStyle w:val="Papertext"/>
+      </w:pPr>
+      <w:r>
+        <w:rPr>
+          <w:b/>
+          <w:i w:val="0"/>
+        </w:rPr>
+        <w:t>Experimento 1 — boolean/Noul:</w:t>
+      </w:r>
+    </w:p>
+    <w:p>
+      <w:pPr>
+        <w:pStyle w:val="Papertext"/>
+        <w:spacing w:line="240" w:lineRule="auto" w:before="0" w:after="0"/>
+      </w:pPr>
+      <w:r>
+        <w:rPr>
+          <w:rFonts w:ascii="Courier New" w:hAnsi="Courier New"/>
+          <w:sz w:val="16"/>
+        </w:rPr>
+        <w:t>TORN-1:         {"wasRed":{"type":"boolean","probability":0.57}}</w:t>
+      </w:r>
+    </w:p>
+    <w:p>
+      <w:pPr>
+        <w:pStyle w:val="Papertext"/>
+        <w:spacing w:line="240" w:lineRule="auto" w:before="0" w:after="0"/>
+      </w:pPr>
+      <w:r>
+        <w:rPr>
+          <w:rFonts w:ascii="Courier New" w:hAnsi="Courier New"/>
+          <w:sz w:val="16"/>
+        </w:rPr>
+        <w:t>TORN-2:         {"wasRed":{"type":"boolean","probability":0.50}}</w:t>
+      </w:r>
+    </w:p>
+    <w:p>
+      <w:pPr>
+        <w:pStyle w:val="Papertext"/>
+        <w:spacing w:line="240" w:lineRule="auto" w:before="0" w:after="0"/>
+      </w:pPr>
+      <w:r>
+        <w:rPr>
+          <w:rFonts w:ascii="Courier New" w:hAnsi="Courier New"/>
+          <w:sz w:val="16"/>
+        </w:rPr>
+        <w:t>SILENT-1:       {"wasRed":{"type":"boolean","probability":0.46}}</w:t>
+      </w:r>
+    </w:p>
+    <w:p>
+      <w:pPr>
+        <w:pStyle w:val="Papertext"/>
+        <w:spacing w:line="240" w:lineRule="auto" w:before="0" w:after="0"/>
+      </w:pPr>
+      <w:r>
+        <w:rPr>
+          <w:rFonts w:ascii="Courier New" w:hAnsi="Courier New"/>
+          <w:sz w:val="16"/>
+        </w:rPr>
+        <w:t>SILENT-2:       {"wasRed":{"type":"boolean","probability":0.48}}</w:t>
+      </w:r>
+    </w:p>
+    <w:p>
+      <w:pPr>
+        <w:pStyle w:val="Papertext"/>
+        <w:spacing w:line="240" w:lineRule="auto" w:before="0" w:after="0"/>
+      </w:pPr>
+      <w:r>
+        <w:rPr>
+          <w:rFonts w:ascii="Courier New" w:hAnsi="Courier New"/>
+          <w:sz w:val="16"/>
+        </w:rPr>
+        <w:t>AGREE-SUPPORT:  {"wasRed":{"type":"boolean","probability":0.83}}</w:t>
+      </w:r>
+    </w:p>
+    <w:p>
+      <w:pPr>
+        <w:pStyle w:val="Papertext"/>
+        <w:spacing w:line="240" w:lineRule="auto" w:before="0" w:after="0"/>
+      </w:pPr>
+      <w:r>
+        <w:rPr>
+          <w:rFonts w:ascii="Courier New" w:hAnsi="Courier New"/>
+          <w:sz w:val="16"/>
+        </w:rPr>
+        <w:t>AGREE-REFUTE:   ERROR - GatewayRateLimitError (rate-limit del nivel gratuito, S8)</w:t>
+      </w:r>
+    </w:p>
+    <w:p>
+      <w:pPr>
+        <w:pStyle w:val="Papertext"/>
+        <w:spacing w:after="120"/>
+      </w:pPr>
+    </w:p>
+    <w:p>
+      <w:pPr>
+        <w:pStyle w:val="Papertext"/>
+      </w:pPr>
+      <w:r>
+        <w:rPr>
+          <w:b/>
+          <w:i w:val="0"/>
+        </w:rPr>
+        <w:t>Experimento 2 — Choice enriquecido:</w:t>
+      </w:r>
+    </w:p>
+    <w:p>
+      <w:pPr>
+        <w:pStyle w:val="Papertext"/>
+        <w:spacing w:line="240" w:lineRule="auto" w:before="0" w:after="0"/>
+      </w:pPr>
+      <w:r>
+        <w:rPr>
+          <w:rFonts w:ascii="Courier New" w:hAnsi="Courier New"/>
+          <w:sz w:val="16"/>
+        </w:rPr>
+        <w:t>TORN-1:         {"lightState":{"choice":"conflicting_evidence","probabilities":</w:t>
+      </w:r>
+    </w:p>
+    <w:p>
+      <w:pPr>
+        <w:pStyle w:val="Papertext"/>
+        <w:spacing w:line="240" w:lineRule="auto" w:before="0" w:after="0"/>
+      </w:pPr>
+      <w:r>
+        <w:rPr>
+          <w:rFonts w:ascii="Courier New" w:hAnsi="Courier New"/>
+          <w:sz w:val="16"/>
+        </w:rPr>
+        <w:t xml:space="preserve">                  {"red":0,"green":0,"conflicting_evidence":1,"insufficient_evidence":0}}}</w:t>
+      </w:r>
+    </w:p>
+    <w:p>
+      <w:pPr>
+        <w:pStyle w:val="Papertext"/>
+        <w:spacing w:line="240" w:lineRule="auto" w:before="0" w:after="0"/>
+      </w:pPr>
+      <w:r>
+        <w:rPr>
+          <w:rFonts w:ascii="Courier New" w:hAnsi="Courier New"/>
+          <w:sz w:val="16"/>
+        </w:rPr>
+        <w:t>TORN-2:         {"lightState":{"choice":"conflicting_evidence","probabilities":</w:t>
+      </w:r>
+    </w:p>
+    <w:p>
+      <w:pPr>
+        <w:pStyle w:val="Papertext"/>
+        <w:spacing w:line="240" w:lineRule="auto" w:before="0" w:after="0"/>
+      </w:pPr>
+      <w:r>
+        <w:rPr>
+          <w:rFonts w:ascii="Courier New" w:hAnsi="Courier New"/>
+          <w:sz w:val="16"/>
+        </w:rPr>
+        <w:t xml:space="preserve">                  {"red":0,"green":0,"conflicting_evidence":1,"insufficient_evidence":0}}}</w:t>
+      </w:r>
+    </w:p>
+    <w:p>
+      <w:pPr>
+        <w:pStyle w:val="Papertext"/>
+        <w:spacing w:line="240" w:lineRule="auto" w:before="0" w:after="0"/>
+      </w:pPr>
+      <w:r>
+        <w:rPr>
+          <w:rFonts w:ascii="Courier New" w:hAnsi="Courier New"/>
+          <w:sz w:val="16"/>
+        </w:rPr>
+        <w:t>SILENT-1:       {"lightState":{"choice":"insufficient_evidence","probabilities":</w:t>
+      </w:r>
+    </w:p>
+    <w:p>
+      <w:pPr>
+        <w:pStyle w:val="Papertext"/>
+        <w:spacing w:line="240" w:lineRule="auto" w:before="0" w:after="0"/>
+      </w:pPr>
+      <w:r>
+        <w:rPr>
+          <w:rFonts w:ascii="Courier New" w:hAnsi="Courier New"/>
+          <w:sz w:val="16"/>
+        </w:rPr>
+        <w:t xml:space="preserve">                  {"red":0,"green":0,"conflicting_evidence":0,"insufficient_evidence":1}}}</w:t>
+      </w:r>
+    </w:p>
+    <w:p>
+      <w:pPr>
+        <w:pStyle w:val="Papertext"/>
+        <w:spacing w:line="240" w:lineRule="auto" w:before="0" w:after="0"/>
+      </w:pPr>
+      <w:r>
+        <w:rPr>
+          <w:rFonts w:ascii="Courier New" w:hAnsi="Courier New"/>
+          <w:sz w:val="16"/>
+        </w:rPr>
+        <w:t>SILENT-2:       {"lightState":{"choice":"insufficient_evidence","probabilities":</w:t>
+      </w:r>
+    </w:p>
+    <w:p>
+      <w:pPr>
+        <w:pStyle w:val="Papertext"/>
+        <w:spacing w:line="240" w:lineRule="auto" w:before="0" w:after="0"/>
+      </w:pPr>
+      <w:r>
+        <w:rPr>
+          <w:rFonts w:ascii="Courier New" w:hAnsi="Courier New"/>
+          <w:sz w:val="16"/>
+        </w:rPr>
+        <w:t xml:space="preserve">                  {"red":0,"green":0,"conflicting_evidence":0,"insufficient_evidence":1}}}</w:t>
+      </w:r>
+    </w:p>
+    <w:p>
+      <w:pPr>
+        <w:pStyle w:val="Papertext"/>
+        <w:spacing w:line="240" w:lineRule="auto" w:before="0" w:after="0"/>
+      </w:pPr>
+      <w:r>
+        <w:rPr>
+          <w:rFonts w:ascii="Courier New" w:hAnsi="Courier New"/>
+          <w:sz w:val="16"/>
+        </w:rPr>
+        <w:t>AGREE-SUPPORT:  {"lightState":{"choice":"red","probabilities":</w:t>
+      </w:r>
+    </w:p>
+    <w:p>
+      <w:pPr>
+        <w:pStyle w:val="Papertext"/>
+        <w:spacing w:line="240" w:lineRule="auto" w:before="0" w:after="0"/>
+      </w:pPr>
+      <w:r>
+        <w:rPr>
+          <w:rFonts w:ascii="Courier New" w:hAnsi="Courier New"/>
+          <w:sz w:val="16"/>
+        </w:rPr>
+        <w:t xml:space="preserve">                  {"red":1,"green":0,"conflicting_evidence":0,"insufficient_evidence":0}}}</w:t>
+      </w:r>
+    </w:p>
+    <w:p>
+      <w:pPr>
+        <w:pStyle w:val="Papertext"/>
+        <w:spacing w:line="240" w:lineRule="auto" w:before="0" w:after="0"/>
+      </w:pPr>
+      <w:r>
+        <w:rPr>
+          <w:rFonts w:ascii="Courier New" w:hAnsi="Courier New"/>
+          <w:sz w:val="16"/>
+        </w:rPr>
+        <w:t>AGREE-REFUTE:   ERROR - GatewayRateLimitError (rate-limit del nivel gratuito, S8)</w:t>
+      </w:r>
+    </w:p>
+    <w:p>
+      <w:pPr>
+        <w:pStyle w:val="Papertext"/>
+        <w:spacing w:after="120"/>
+      </w:pPr>
+    </w:p>
+    <w:p>
+      <w:pPr>
+        <w:pStyle w:val="Papertext"/>
+      </w:pPr>
+      <w:r>
+        <w:rPr>
+          <w:b/>
+          <w:i w:val="0"/>
+        </w:rPr>
+        <w:t>Experimento 3 — Choice binario:</w:t>
+      </w:r>
+    </w:p>
+    <w:p>
+      <w:pPr>
+        <w:pStyle w:val="Papertext"/>
+        <w:spacing w:line="240" w:lineRule="auto" w:before="0" w:after="0"/>
+      </w:pPr>
+      <w:r>
+        <w:rPr>
+          <w:rFonts w:ascii="Courier New" w:hAnsi="Courier New"/>
+          <w:sz w:val="16"/>
+        </w:rPr>
+        <w:t>TORN-1:         {"lightState":{"choice":"red","probabilities":{"red":0.85,"green":0.15}}}</w:t>
+      </w:r>
+    </w:p>
+    <w:p>
+      <w:pPr>
+        <w:pStyle w:val="Papertext"/>
+        <w:spacing w:line="240" w:lineRule="auto" w:before="0" w:after="0"/>
+      </w:pPr>
+      <w:r>
+        <w:rPr>
+          <w:rFonts w:ascii="Courier New" w:hAnsi="Courier New"/>
+          <w:sz w:val="16"/>
+        </w:rPr>
+        <w:t>TORN-2:         {"lightState":{"choice":"red","probabilities":{"red":0.84,"green":0.16}}}</w:t>
+      </w:r>
+    </w:p>
+    <w:p>
+      <w:pPr>
+        <w:pStyle w:val="Papertext"/>
+        <w:spacing w:line="240" w:lineRule="auto" w:before="0" w:after="0"/>
+      </w:pPr>
+      <w:r>
+        <w:rPr>
+          <w:rFonts w:ascii="Courier New" w:hAnsi="Courier New"/>
+          <w:sz w:val="16"/>
+        </w:rPr>
+        <w:t>SILENT-1:       {"lightState":{"choice":"red","probabilities":{"red":0.67,"green":0.33}}}</w:t>
+      </w:r>
+    </w:p>
+    <w:p>
+      <w:pPr>
+        <w:pStyle w:val="Papertext"/>
+        <w:spacing w:line="240" w:lineRule="auto" w:before="0" w:after="0"/>
+      </w:pPr>
+      <w:r>
+        <w:rPr>
+          <w:rFonts w:ascii="Courier New" w:hAnsi="Courier New"/>
+          <w:sz w:val="16"/>
+        </w:rPr>
+        <w:t>SILENT-2:       {"lightState":{"choice":"red","probabilities":{"red":0.77,"green":0.23}}}</w:t>
+      </w:r>
+    </w:p>
+    <w:p>
+      <w:pPr>
+        <w:pStyle w:val="Papertext"/>
+        <w:spacing w:line="240" w:lineRule="auto" w:before="0" w:after="0"/>
+      </w:pPr>
+      <w:r>
+        <w:rPr>
+          <w:rFonts w:ascii="Courier New" w:hAnsi="Courier New"/>
+          <w:sz w:val="16"/>
+        </w:rPr>
+        <w:t>AGREE-SUPPORT:  {"lightState":{"choice":"red","probabilities":{"red":1,"green":0}}}</w:t>
+      </w:r>
+    </w:p>
+    <w:p>
+      <w:pPr>
+        <w:pStyle w:val="Papertext"/>
+        <w:spacing w:line="240" w:lineRule="auto" w:before="0" w:after="0"/>
+      </w:pPr>
+      <w:r>
+        <w:rPr>
+          <w:rFonts w:ascii="Courier New" w:hAnsi="Courier New"/>
+          <w:sz w:val="16"/>
+        </w:rPr>
+        <w:t>AGREE-REFUTE:   ERROR - GatewayRateLimitError (rate-limit del nivel gratuito, S8)</w:t>
+      </w:r>
+    </w:p>
+    <w:p>
+      <w:pPr>
+        <w:pStyle w:val="Papertext"/>
+        <w:spacing w:after="120"/>
+      </w:pPr>
     </w:p>
     <w:sectPr>
       <w:footnotePr>

</xml_diff>